<commit_message>
Re-audit AI PRD against the last 5 days of shipped changes
The PRD was last refreshed 2026-08-21, but the cost calculator was removed,
Find Housing's cards were unified with stateful housing-type selection, a
narrow user-activity context feed (advisorAppContext) now reaches the
Advisor, Check the Place dropped rent/CMHC visuals for saved places, and
client-side advisor limits and a GEMINI_API_KEY rename shipped. Updated the
17 affected passages (Product Concept, Guardrails, Data Requirements,
Failure Modes, user stories, and the Appendix) to match.
</commit_message>
<xml_diff>
--- a/Home-Compass-AI-PRD.docx
+++ b/Home-Compass-AI-PRD.docx
@@ -27,7 +27,7 @@
           <w:color w:val="606060"/>
           <w:sz w:val="19"/>
         </w:rPr>
-        <w:t>Compiled 2026-08-21 by direct source-code audit (routes, components, ingestion pipeline, AI system prompt) rather than README.md / docs/user-and-data-flow.md, both confirmed stale. Refreshed same day after the Evaluate Housing rebuild (static checklist + cost calculator, AI Advisor hooks removed).</w:t>
+        <w:t>Compiled 2026-08-21 by direct source-code audit; re-audited 2026-08-26 after five days of further changes: the monthly cost calculator was removed (2026-08-22), Find Housing's duration and housing-type cards were unified onto one card component with housing-type selection becoming single-select and stateful, a passive one-way context feed now summarizes the user's own reviewed criteria and selected housing type into the Advisor's prompt (the "lift-static-context-into-advisor" PRs, 2026-08-22 to 2026-08-24) without crossing the curated/ingested-data boundary, Check the Place dropped its rent/CMHC visuals and a short-lived safest/highest-crime comparison in favor of a single crime table plus a localStorage-backed saved-places list, client-side session/character/IP-rate limits were added to the Advisor (2026-08-22), the Gemini fallback env var was renamed to GEMINI_API_KEY for clarity (2026-08-25), and README.md / docs/user-and-data-flow.md were refreshed to match (2026-08-26).</w:t>
       </w:r>
       <w:r>
         <w:br/>
@@ -47,23 +47,21 @@
           <w:sz w:val="20"/>
         </w:rPr>
         <w:t>Classification: Level 2 (AI-Assisted) at the product level, with the AI Advisor sub-feature operating as a Level 3 (AI-Native) conversational experience.</w:t>
+        <w:br/>
+        <w:br/>
+        <w:t>Litmus test: if the AI Advisor were removed, Find Housing, Evaluate Housing, the settlement Journey checklist, and the Check the Place address report would all still work — they are deterministic, sourced, and pre-built. As of 2026-08-21 this is stronger than before: Evaluate Housing's old "Ask the AI Advisor about this" buttons are gone, so Column 2 now contains zero references to the Advisor anywhere. Only the third column (a chat experience where the model's judgment IS the output) disappears. That sub-feature therefore gets the full Tier 2/3 AI treatment below; the deterministic "static reference lane" gets the lighter Level 1 treatment appropriate to it. This still holds as of 2026-08-26: no button anywhere in Column 2 opens or writes to the Advisor. The one addition since is passive, not a UI affordance — every Advisor request now carries a short summary of the user's own Evaluate Housing progress and selected housing type (flow-state.tsx's advisorAppContext), so removing the Advisor loses that summary but changes nothing about how Column 2 itself behaves.</w:t>
       </w:r>
-      <w:r>
-        <w:br/>
-      </w:r>
+      <w:r/>
       <w:r>
         <w:rPr>
           <w:sz w:val="20"/>
         </w:rPr>
       </w:r>
-      <w:r>
-        <w:br/>
-      </w:r>
+      <w:r/>
       <w:r>
         <w:rPr>
           <w:sz w:val="20"/>
         </w:rPr>
-        <w:t>Litmus test: if the AI Advisor were removed, Find Housing, Evaluate Housing, the settlement Journey checklist, and the Check the Place address report would all still work — they are deterministic, sourced, and pre-built. As of 2026-08-21 this is stronger than before: Evaluate Housing's old "Ask the AI Advisor about this" buttons are gone, so Column 2 now contains zero references to the Advisor anywhere. Only the third column (a chat experience where the model's judgment IS the output) disappears. That sub-feature therefore gets the full Tier 2/3 AI treatment below; the deterministic "static reference lane" gets the lighter Level 1 treatment appropriate to it.</w:t>
       </w:r>
     </w:p>
     <w:p/>
@@ -120,7 +118,7 @@
         <w:rPr>
           <w:i w:val="0"/>
         </w:rPr>
-        <w:t>Home Compass is a single-page web app (TanStack Start + React 19, deployed as one route) that helps newcomers to Ontario — international students, principal applicants with a job offer, and other immigration streams — plan and verify their housing. It runs a strict three-column, two-lane layout: a static "reference lane" of pre-built, sourced content (Find Housing guidance, an Evaluate Housing checklist, a settlement Journey checklist, and a "Check the Place" address report built on ingested City of Toronto Police and Census/CMHC data), and a conversational "AI Advisor" lane for open-ended questions. The two lanes are deliberately never mixed: no ingested data is fed into the Advisor's prompt, no AI output is ever written into the sourced columns, and — as of 2026-08-21 — the static lane contains no buttons or links into the Advisor either, so the separation is now total in one direction. The UI can honestly label one column "Reference" and the other "AI response."</w:t>
+        <w:t>Home Compass is a single-page web app (TanStack Start + React 19, deployed as one route) that helps newcomers to Ontario — international students, principal applicants with a job offer, and other immigration streams — plan and verify their housing. It runs a strict three-column, two-lane layout: a static "reference lane" of pre-built, sourced content (Find Housing guidance, an Evaluate Housing checklist, a settlement Journey checklist, and a "Check the Place" address report built on ingested City of Toronto Police and Census/CMHC data), and a conversational "AI Advisor" lane for open-ended questions. The two lanes are deliberately never mixed: no ingested data is fed into the Advisor's prompt, no AI output is ever written into the sourced columns, and — as of 2026-08-26 — the static lane still contains no buttons or links into the Advisor. The one exception to the "never mixed" rule is deliberate and narrow: the Advisor's context string now carries a summary of the user's own Evaluate Housing progress and selected housing type, never the ingested safety/rent data and never anything the user didn't do themselves. The UI can still honestly label one column "Reference" and the other "AI response."</w:t>
       </w:r>
     </w:p>
     <w:p>
@@ -360,7 +358,7 @@
         <w:pStyle w:val="ListBullet"/>
       </w:pPr>
       <w:r>
-        <w:t>Column 2 — Static reference lane: three locked sections (Find Housing, Evaluate Housing, Verify the Place — housing-sections.ts explicitly caps scope here, "no risk ratings or timelines," "no listings/prices"). Find Housing shows duration and housing-type card groups (the housing-type cards' dead "Learn more" link was removed on 2026-08-21 rather than left pointing nowhere). Evaluate Housing is a 14-item checklist with a per-item "Reviewed" toggle tracked in local storage and a monthly cost calculator that defaults every field to $0. Verify the Place is the "Check the Place" address report, now rendered directly rather than behind a second, duplicate collapsible header.</w:t>
+        <w:t>Column 2 — Static reference lane: three locked sections (Find Housing, Evaluate Housing, Verify the Place — housing-sections.ts explicitly caps scope here, "no risk ratings or timelines," "no listings/prices"). Find Housing shows duration and housing-type cards on a single shared card component (unified 2026-08-23); housing-type cards are now single-select, with the selection lifted into FlowProvider (selectedHousingTypeId) rather than being purely visual. Evaluate Housing is a 14-item checklist with a per-item "Reviewed" toggle tracked in local storage; the monthly cost calculator was removed on 2026-08-22 for producing a misleadingly precise total from unverified inputs. Verify the Place is the "Check the Place" address report: a single crime-rate comparison table against the citywide average (rent/CMHC visuals and a short-lived safest/highest-crime comparison were both dropped, 2026-08-23/24), plus a localStorage-backed "Saved Places" shortlist.</w:t>
       </w:r>
     </w:p>
     <w:p>
@@ -368,7 +366,7 @@
         <w:pStyle w:val="ListBullet"/>
       </w:pPr>
       <w:r>
-        <w:t>Column 3 — AI Advisor: a docked, persistent chat panel (never a bubble or fullscreen — an intentional layout constraint) for open-ended questions. There is no hand-off in the other direction any more: an earlier one-way prompt hand-off from Column 2 ("Ask the AI Advisor about this" on every Evaluate Housing item) was removed on 2026-08-21 so that section reads as fully static. The Advisor's own empty state still offers quick-jump buttons back into Column 2's sections — the only cross-lane link left, and it only runs AI-to-static.</w:t>
+        <w:t>Column 3 — AI Advisor: a docked, persistent chat panel (never a bubble or fullscreen — an intentional layout constraint) for open-ended questions. No UI control anywhere in Column 2 opens or writes to the Advisor: the 2026-08-21 removal of the "Ask the AI Advisor about this" buttons still holds, and flow-state.tsx's askAdvisor()/advisorPrompt plumbing built for those buttons remains in the code but is called by nothing (dead code, unchanged from the prior audit). Since 2026-08-22, a separate and narrower mechanism does carry data one-way from Column 2 into the Advisor: every request's context string now appends a summary of the user's reviewed Evaluate Housing criteria and selected housing type (advisorAppContext), deliberately excluding any curated/ingested data. The Advisor's own empty state still offers quick-jump buttons back into Column 2's sections — the only cross-lane UI link, and it only runs AI-to-static.</w:t>
       </w:r>
     </w:p>
     <w:p/>
@@ -624,7 +622,7 @@
         <w:rPr>
           <w:i w:val="0"/>
         </w:rPr>
-        <w:t>In scope today: Find Housing (duration + housing-type cards), Evaluate Housing (8-topic, 14-item checklist with local reviewed-tracking, plus a 5-field monthly cost calculator that starts every field at $0), settlement Journey checklist, Check the Place (address → neighbourhood safety/rent comparison), AI Advisor chat.</w:t>
+        <w:t>In scope today: Find Housing (duration + single-select housing-type cards), Evaluate Housing (8-topic, 14-item checklist with local reviewed-tracking; no cost calculator as of 2026-08-22), settlement Journey checklist, Check the Place (address → neighbourhood crime-rate comparison plus a saved-places shortlist; no rent/CMHC visuals as of 2026-08-23), AI Advisor chat (now context-aware of the user's own Evaluate Housing progress and housing-type selection).</w:t>
       </w:r>
     </w:p>
     <w:p>
@@ -1101,7 +1099,7 @@
           </w:tcPr>
           <w:p>
             <w:r>
-              <w:t>None found — no PII scrub, no prompt-injection screen, no rate limiting beyond the 12-message history cap</w:t>
+              <w:t>Session question cap (15), per-message character cap (600 chars), an 8-turn history cap, and a per-IP hourly request budget (40/hr) added 2026-08-22 (src/lib/advisor-limits.ts), enforced both client- and server-side. Still no PII scrub or prompt-injection screening.</w:t>
             </w:r>
           </w:p>
         </w:tc>
@@ -1111,7 +1109,7 @@
           </w:tcPr>
           <w:p>
             <w:r>
-              <w:t>Add basic abuse/injection screening before MVP; document what gets rejected</w:t>
+              <w:t>Add abuse/injection screening — volume and cost are now capped, so this gap is specifically about content, not spend.</w:t>
             </w:r>
           </w:p>
         </w:tc>
@@ -1165,7 +1163,7 @@
           </w:tcPr>
           <w:p>
             <w:r>
-              <w:t>Advisor is read-only/conversational; cannot execute actions or write into the static data lane. The one-way prompt hand-off that used to run from Column 2 into the Advisor ("Ask the AI Advisor about this") was removed entirely on 2026-08-21 — Column 2 now contains zero references to the Advisor. Enforced by omission (no code path exists), not by an explicit guard.</w:t>
+              <w:t>Advisor is read-only/conversational; cannot execute actions or write into the static data lane. The old UI hand-off ("Ask the AI Advisor about this") is still gone, and its dead askAdvisor()/advisorPrompt plumbing remains unused. Since 2026-08-22 the Advisor does receive a one-way, read-only summary of the user's own Evaluate Housing/housing-type state (advisorAppContext) — a deliberately narrower exception to the boundary that still excludes src/data/generated (safety/rent/CMHC). Enforced by convention (comments in flow-state.tsx and advisor.ts), not by an explicit guard.</w:t>
             </w:r>
           </w:p>
         </w:tc>
@@ -1175,7 +1173,7 @@
           </w:tcPr>
           <w:p>
             <w:r>
-              <w:t>Add an explicit assertion/lint rule that advisor.ts never imports from src/data/generated — makes the two-lane boundary a build-time guarantee, not a convention</w:t>
+              <w:t>Add an explicit assertion/lint rule that advisor.ts never imports from src/data/generated — now more important, since a real (if narrow) exception to the boundary exists and any future addition to advisorAppContext needs the same discipline.</w:t>
             </w:r>
           </w:p>
         </w:tc>
@@ -1227,7 +1225,7 @@
         <w:pStyle w:val="ListBullet"/>
       </w:pPr>
       <w:r>
-        <w:t>Current: Primary path is the Lovable AI Gateway calling google/gemini-2.5-flash over an OpenAI-compatible SSE endpoint; fallback is a direct Gemini API call (gemini-2.0-flash by default, overridable via GEMINI_MODEL) using native Gemini SSE. Both paths are the same underlying model family — there is no second provider today.</w:t>
+        <w:t>Current: Primary path is the Lovable AI Gateway calling google/gemini-2.5-flash over an OpenAI-compatible SSE endpoint; fallback is a direct Gemini API call (gemini-2.0-flash by default, overridable via GEMINI_MODEL) using native Gemini SSE. Both paths are the same underlying model family — there is no second provider today. (The direct-fallback key's env var was renamed to GEMINI_API_KEY on 2026-08-25 for clarity; no behavior change.)</w:t>
       </w:r>
     </w:p>
     <w:p>
@@ -1332,7 +1330,7 @@
           </w:tcPr>
           <w:p>
             <w:r>
-              <w:t>System-prompt instructions only — no RAG, no retrieval. The two-lane boundary explicitly forbids feeding the ingestion pipeline's safety/rent/CMHC data — or the Evaluate Housing checklist/cost-calculator state — into the Advisor's context, even though it would improve grounding — this is an intentional, user-confirmed trade for the "Reference vs. AI response" trust distinction.</w:t>
+              <w:t>System-prompt instructions only — no RAG, no retrieval of curated/ingested data. The boundary still explicitly forbids feeding the ingestion pipeline's safety/rent/CMHC data (src/data/generated/*) into the Advisor's context. That boundary was narrowed on 2026-08-22–24: the user's own Evaluate Housing reviewed-criteria and selected housing type are now summarized into the context string (advisorAppContext), on the stated reasoning that this is the user's own in-app activity, not curated/ingested data. The cost-calculator state this note used to also cover no longer exists — that feature was removed 2026-08-22.</w:t>
             </w:r>
           </w:p>
         </w:tc>
@@ -1677,7 +1675,7 @@
           </w:tcPr>
           <w:p>
             <w:r>
-              <w:t>History hard-capped at last 12 messages</w:t>
+              <w:t>History hard-capped at last 8 turns (tightened from 12 on 2026-08-22, alongside a 15-question session cap and a 40-req/hour per-IP budget — see Guardrails)</w:t>
             </w:r>
           </w:p>
         </w:tc>
@@ -1697,7 +1695,7 @@
           </w:tcPr>
           <w:p>
             <w:r>
-              <w:t>Acceptable for MVP; revisit if conversations regularly exceed 12 turns</w:t>
+              <w:t>Acceptable for MVP; revisit if conversations regularly exceed 8 turns</w:t>
             </w:r>
           </w:p>
         </w:tc>
@@ -1807,7 +1805,7 @@
         <w:pStyle w:val="ListBullet"/>
       </w:pPr>
       <w:r>
-        <w:t>Minor cleanup carried over from the 2026-08-21 Evaluate Housing rebuild: flow-state.tsx still exposes an askAdvisor() function and an advisorPrompt hand-off built for the now-removed "Ask the AI Advisor about this" buttons. Nothing calls it anymore — harmless, but should be deleted rather than copied into a rebuild.</w:t>
+        <w:t>Minor cleanup carried over from the 2026-08-21 Evaluate Housing rebuild: flow-state.tsx still exposes an askAdvisor() function and an advisorPrompt hand-off built for the now-removed "Ask the AI Advisor about this" buttons. Nothing calls it anymore — harmless, but should be deleted rather than copied into a rebuild. (Do not confuse this dead code with advisorAppContext, added 2026-08-22, which is a live, actively-used one-way context feed — see Product Concept and Data Requirements.)</w:t>
       </w:r>
     </w:p>
     <w:p>
@@ -1815,7 +1813,7 @@
         <w:pStyle w:val="ListBullet"/>
       </w:pPr>
       <w:r>
-        <w:t>This document should be revised whenever the validator ships, whenever the Advisor header copy changes, or whenever CMHC data becomes available (a static-lane change, but one that changes what "grounding data exists but is withheld from the Advisor" means in practice).</w:t>
+        <w:t>This document should be revised whenever the validator ships, whenever the Advisor header copy changes, or whenever CMHC data becomes available and is wired back into Check the Place (the UI block that used to reference it was removed 2026-08-23 rather than backfilled — see Appendix).</w:t>
       </w:r>
     </w:p>
     <w:p/>
@@ -1881,7 +1879,7 @@
         <w:rPr>
           <w:i w:val="0"/>
         </w:rPr>
-        <w:t>As a newcomer comparing housing options, I want to work through an evaluation checklist and add up my own monthly costs, so that I can track what I've already considered and see a real total — with every cost field starting at $0 and every "reviewed" mark kept only in my own browser, never a server, never a suggested "typical" number I didn't enter myself.</w:t>
+        <w:t>As a newcomer comparing housing options, I want to work through an evaluation checklist and mark what I've already reviewed, so that I can track my own progress — kept only in my own browser, never a server, never a computed total the app implies is authoritative (the monthly cost calculator was removed 2026-08-22 for implying more precision than five self-entered numbers can support). As a newcomer checking a specific address, I want to bookmark it to a saved-places list, so that I can come back and compare a shortlist without retyping each one — also kept only in my own browser.</w:t>
       </w:r>
     </w:p>
     <w:p>
@@ -1897,7 +1895,7 @@
         <w:rPr>
           <w:i w:val="0"/>
         </w:rPr>
-        <w:t>Compiled directly from source on 2026-08-21. The most actionable output of this PRD: everywhere the shipped product currently says something about itself that the code doesn't back up.</w:t>
+        <w:t>Compiled directly from source on 2026-08-21; re-verified 2026-08-26 (one row, CMHC, was resolved and removed — see "Recently resolved" below). The most actionable output of this PRD: everywhere the shipped product currently says something about itself that the code doesn't back up.</w:t>
       </w:r>
     </w:p>
     <w:tbl>
@@ -2111,48 +2109,6 @@
           </w:tcPr>
           <w:p>
             <w:r>
-              <w:t>CMHC city-wide rent baseline</w:t>
-            </w:r>
-          </w:p>
-        </w:tc>
-        <w:tc>
-          <w:tcPr>
-            <w:tcW w:type="dxa" w:w="1872"/>
-          </w:tcPr>
-          <w:p>
-            <w:r>
-              <w:t>check-the-place-report.tsx / cmhc_baseline.json</w:t>
-            </w:r>
-          </w:p>
-        </w:tc>
-        <w:tc>
-          <w:tcPr>
-            <w:tcW w:type="dxa" w:w="3456"/>
-          </w:tcPr>
-          <w:p>
-            <w:r>
-              <w:t>File not present; CMHC_XLSX_URL requires a manual capture from CMHC's HMIP portal (no stable public URL exists) — component degrades cleanly to a null-gated block, not an error</w:t>
-            </w:r>
-          </w:p>
-        </w:tc>
-        <w:tc>
-          <w:tcPr>
-            <w:tcW w:type="dxa" w:w="1728"/>
-          </w:tcPr>
-          <w:p>
-            <w:r>
-              <w:t>Either source and ingest CMHC data or drop the UI block referencing it</w:t>
-            </w:r>
-          </w:p>
-        </w:tc>
-      </w:tr>
-      <w:tr>
-        <w:tc>
-          <w:tcPr>
-            <w:tcW w:type="dxa" w:w="2304"/>
-          </w:tcPr>
-          <w:p>
-            <w:r>
               <w:t>Supabase-backed accounts (implied by boilerplate)</w:t>
             </w:r>
           </w:p>
@@ -2195,7 +2151,7 @@
         <w:rPr>
           <w:i w:val="0"/>
         </w:rPr>
-        <w:t>Recently resolved (no longer live discrepancies as of 2026-08-21): the housing-type cards' dead "Learn more" link — which used to render with no destination — was removed outright rather than wired up or left in place; and Evaluate Housing's "Ask the AI Advisor about this" buttons were replaced with a fully static, locally-tracked reviewed-checklist plus the monthly cost calculator described in Tier 1's Product Concept.</w:t>
+        <w:t>Recently resolved: as of 2026-08-21, the housing-type cards' dead "Learn more" link — which used to render with no destination — was removed outright rather than wired up or left in place, and Evaluate Housing's "Ask the AI Advisor about this" buttons were replaced with a fully static, locally-tracked reviewed-checklist. As of 2026-08-22–26: the monthly cost calculator introduced alongside that reviewed-checklist was itself removed for implying false precision; Find Housing's duration and housing-type cards were unified onto one card component, with housing-type selection becoming stateful (see Product Concept); the CMHC city-wide rent baseline gap flagged in a prior version of this Appendix was resolved by dropping the referencing UI block from Check the Place entirely rather than sourcing the data (the ingestion script and generated-data plumbing for it still exist, unused); a short-lived safest/highest-crime comparison in Check the Place was replaced with a localStorage-backed saved-places list; client-side session/character/IP-rate limits were added to the Advisor; and this document, README.md, and docs/user-and-data-flow.md were all re-audited against the current codebase on 2026-08-26.</w:t>
       </w:r>
     </w:p>
     <w:sectPr>

</xml_diff>